<commit_message>
feat: add project cloning details for Tok Tok Taxi to CV and project descriptions
</commit_message>
<xml_diff>
--- a/assets/cv/mostafa_karam_saeed_cv.docx
+++ b/assets/cv/mostafa_karam_saeed_cv.docx
@@ -114,21 +114,7 @@
         <w:rPr>
           <w:color w:val="333333"/>
         </w:rPr>
-        <w:t xml:space="preserve">Flutter Developer with 2 years of professional experience at </w:t>
-      </w:r>
-      <w:proofErr w:type="spellStart"/>
-      <w:r>
-        <w:rPr>
-          <w:color w:val="333333"/>
-        </w:rPr>
-        <w:t>MDSoft</w:t>
-      </w:r>
-      <w:proofErr w:type="spellEnd"/>
-      <w:r>
-        <w:rPr>
-          <w:color w:val="333333"/>
-        </w:rPr>
-        <w:t>, developing and maintaining production-ready mobile and dashboard applications. Experienced in building scalable Flutter applications using Dart, Clean Architecture, Bloc/Cubit, REST APIs, Firebase, and modern development practices. Contributed to 5 live production projects, including mobile applications published on Google Play and the Apple App Store, along with web-based dashboards. Also familiar with AI Automation and integrating automation concepts into modern software development workflows.</w:t>
+        <w:t xml:space="preserve">Flutter Developer with 2 years of professional experience at MDSoft, developing and maintaining production-ready mobile and dashboard applications. Experienced in building scalable Flutter applications using Dart, Clean Architecture, Bloc/Cubit, REST APIs, Firebase, and modern development practices. Contributed to 5 live production projects, including mobile applications published on Google Play and the Apple App Store, along with web-based dashboards. Also familiar with AI Automation and integrating automation concepts into modern software development workflows.</w:t>
       </w:r>
     </w:p>
     <w:p>
@@ -165,20 +151,8 @@
           <w:sz w:val="21"/>
           <w:szCs w:val="21"/>
         </w:rPr>
-        <w:t xml:space="preserve">Flutter Developer · </w:t>
-      </w:r>
-      <w:proofErr w:type="spellStart"/>
-      <w:r>
-        <w:rPr>
-          <w:b/>
-          <w:bCs/>
-          <w:color w:val="333333"/>
-          <w:sz w:val="21"/>
-          <w:szCs w:val="21"/>
-        </w:rPr>
-        <w:t>MDSoft</w:t>
-      </w:r>
-      <w:proofErr w:type="spellEnd"/>
+        <w:t xml:space="preserve">Flutter Developer · MDSoft</w:t>
+      </w:r>
       <w:r>
         <w:rPr>
           <w:i/>
@@ -218,21 +192,7 @@
         <w:rPr>
           <w:color w:val="333333"/>
         </w:rPr>
-        <w:t xml:space="preserve">Built and deployed KORLEN, a full-featured e-commerce app, along with 2 white-label clones: HTG and Veron, sharing a common codebase with </w:t>
-      </w:r>
-      <w:proofErr w:type="spellStart"/>
-      <w:r>
-        <w:rPr>
-          <w:color w:val="333333"/>
-        </w:rPr>
-        <w:t>customised</w:t>
-      </w:r>
-      <w:proofErr w:type="spellEnd"/>
-      <w:r>
-        <w:rPr>
-          <w:color w:val="333333"/>
-        </w:rPr>
-        <w:t xml:space="preserve"> branding and configuration.</w:t>
+        <w:t xml:space="preserve">Built and deployed KORLEN, a full-featured e-commerce app, along with 2 white-label clones: HTG and Veron, sharing a common codebase with customised branding and configuration.</w:t>
       </w:r>
     </w:p>
     <w:p>
@@ -248,21 +208,7 @@
         <w:rPr>
           <w:color w:val="333333"/>
         </w:rPr>
-        <w:t xml:space="preserve">Developed Tok </w:t>
-      </w:r>
-      <w:proofErr w:type="spellStart"/>
-      <w:r>
-        <w:rPr>
-          <w:color w:val="333333"/>
-        </w:rPr>
-        <w:t>Tok</w:t>
-      </w:r>
-      <w:proofErr w:type="spellEnd"/>
-      <w:r>
-        <w:rPr>
-          <w:color w:val="333333"/>
-        </w:rPr>
-        <w:t xml:space="preserve"> Taxi, a complete delivery and ride-hailing platform with live location tracking, an admin dashboard, and separate user, driver, and agent applications, including Bluetooth receipt printing and internal printing support.</w:t>
+        <w:t xml:space="preserve">Developed Tok Tok Taxi, a complete delivery and ride-hailing platform with live location tracking, an admin dashboard, and separate user, driver, and agent applications, including Bluetooth receipt printing and internal printing support.</w:t>
       </w:r>
     </w:p>
     <w:p>
@@ -294,21 +240,7 @@
         <w:rPr>
           <w:color w:val="333333"/>
         </w:rPr>
-        <w:t xml:space="preserve">Developed VA Note, a patient management and appointment scheduling app with Firebase </w:t>
-      </w:r>
-      <w:proofErr w:type="spellStart"/>
-      <w:r>
-        <w:rPr>
-          <w:color w:val="333333"/>
-        </w:rPr>
-        <w:t>Firestore</w:t>
-      </w:r>
-      <w:proofErr w:type="spellEnd"/>
-      <w:r>
-        <w:rPr>
-          <w:color w:val="333333"/>
-        </w:rPr>
-        <w:t>, FCM reminders, and MVVM Clean Architecture.</w:t>
+        <w:t xml:space="preserve">Developed VA Note, a patient management and appointment scheduling app with Firebase Firestore, FCM reminders, and MVVM Clean Architecture.</w:t>
       </w:r>
     </w:p>
     <w:p>
@@ -324,21 +256,7 @@
         <w:rPr>
           <w:color w:val="333333"/>
         </w:rPr>
-        <w:t xml:space="preserve">Developed Vitamin, a restaurant order management app with a customer ordering app and an admin dashboard for managing orders, categories, and sub-products, integrated with a third-party delivery service and the </w:t>
-      </w:r>
-      <w:proofErr w:type="spellStart"/>
-      <w:r>
-        <w:rPr>
-          <w:color w:val="333333"/>
-        </w:rPr>
-        <w:t>QCard</w:t>
-      </w:r>
-      <w:proofErr w:type="spellEnd"/>
-      <w:r>
-        <w:rPr>
-          <w:color w:val="333333"/>
-        </w:rPr>
-        <w:t xml:space="preserve"> payment gateway.</w:t>
+        <w:t xml:space="preserve">Developed Vitamin, a restaurant order management app with a customer ordering app and an admin dashboard for managing orders, categories, and sub-products, integrated with a third-party delivery service and the QCard payment gateway.</w:t>
       </w:r>
     </w:p>
     <w:p>
@@ -415,29 +333,7 @@
           <w:sz w:val="19"/>
           <w:szCs w:val="19"/>
         </w:rPr>
-        <w:t xml:space="preserve">Flutter, Dart, Firebase (Auth, </w:t>
-      </w:r>
-      <w:proofErr w:type="spellStart"/>
-      <w:r>
-        <w:rPr>
-          <w:i/>
-          <w:iCs/>
-          <w:color w:val="555555"/>
-          <w:sz w:val="19"/>
-          <w:szCs w:val="19"/>
-        </w:rPr>
-        <w:t>Firestore</w:t>
-      </w:r>
-      <w:proofErr w:type="spellEnd"/>
-      <w:r>
-        <w:rPr>
-          <w:i/>
-          <w:iCs/>
-          <w:color w:val="555555"/>
-          <w:sz w:val="19"/>
-          <w:szCs w:val="19"/>
-        </w:rPr>
-        <w:t>, FCM), REST APIs, Bloc/Cubit, MVVM, Clean Architecture</w:t>
+        <w:t xml:space="preserve">Flutter, Dart, Firebase (Auth, Firestore, FCM), REST APIs, Bloc/Cubit, MVVM, Clean Architecture</w:t>
       </w:r>
     </w:p>
     <w:p>
@@ -554,29 +450,7 @@
           <w:sz w:val="21"/>
           <w:szCs w:val="21"/>
         </w:rPr>
-        <w:t xml:space="preserve">Tok </w:t>
-      </w:r>
-      <w:proofErr w:type="spellStart"/>
-      <w:r>
-        <w:rPr>
-          <w:b/>
-          <w:bCs/>
-          <w:color w:val="333333"/>
-          <w:sz w:val="21"/>
-          <w:szCs w:val="21"/>
-        </w:rPr>
-        <w:t>Tok</w:t>
-      </w:r>
-      <w:proofErr w:type="spellEnd"/>
-      <w:r>
-        <w:rPr>
-          <w:b/>
-          <w:bCs/>
-          <w:color w:val="333333"/>
-          <w:sz w:val="21"/>
-          <w:szCs w:val="21"/>
-        </w:rPr>
-        <w:t xml:space="preserve"> Taxi — Delivery &amp; Ride-Hailing Platform</w:t>
+        <w:t xml:space="preserve">Tok Tok Taxi — Delivery &amp; Ride-Hailing Platform</w:t>
       </w:r>
     </w:p>
     <w:p>
@@ -603,29 +477,7 @@
           <w:sz w:val="19"/>
           <w:szCs w:val="19"/>
         </w:rPr>
-        <w:t xml:space="preserve">Flutter, Dart, Firebase (Auth, </w:t>
-      </w:r>
-      <w:proofErr w:type="spellStart"/>
-      <w:r>
-        <w:rPr>
-          <w:i/>
-          <w:iCs/>
-          <w:color w:val="555555"/>
-          <w:sz w:val="19"/>
-          <w:szCs w:val="19"/>
-        </w:rPr>
-        <w:t>Firestore</w:t>
-      </w:r>
-      <w:proofErr w:type="spellEnd"/>
-      <w:r>
-        <w:rPr>
-          <w:i/>
-          <w:iCs/>
-          <w:color w:val="555555"/>
-          <w:sz w:val="19"/>
-          <w:szCs w:val="19"/>
-        </w:rPr>
-        <w:t>, FCM), REST APIs, Google Maps, Bloc/Cubit, MVVM, Clean Architecture</w:t>
+        <w:t xml:space="preserve">Flutter, Dart, Firebase (Auth, Firestore, FCM), REST APIs, Google Maps, Bloc/Cubit, MVVM, Clean Architecture</w:t>
       </w:r>
     </w:p>
     <w:p>
@@ -816,6 +668,22 @@
     </w:p>
     <w:p>
       <w:pPr>
+        <w:pStyle w:val="ListParagraph"/>
+        <w:numPr>
+          <w:ilvl w:val="0"/>
+          <w:numId w:val="2"/>
+        </w:numPr>
+        <w:spacing w:after="60"/>
+      </w:pPr>
+      <w:r>
+        <w:rPr>
+          <w:color w:val="333333"/>
+        </w:rPr>
+        <w:t>Cloned the entire Tok Tok Taxi project into a new standalone product named Makana, reusing the core architecture with new branding and configuration.</w:t>
+      </w:r>
+    </w:p>
+    <w:p>
+      <w:pPr>
         <w:spacing w:before="160" w:after="40"/>
       </w:pPr>
       <w:r>
@@ -853,51 +721,7 @@
           <w:sz w:val="19"/>
           <w:szCs w:val="19"/>
         </w:rPr>
-        <w:t xml:space="preserve">Flutter, Dart, Firebase (Auth, </w:t>
-      </w:r>
-      <w:proofErr w:type="spellStart"/>
-      <w:r>
-        <w:rPr>
-          <w:i/>
-          <w:iCs/>
-          <w:color w:val="555555"/>
-          <w:sz w:val="19"/>
-          <w:szCs w:val="19"/>
-        </w:rPr>
-        <w:t>Firestore</w:t>
-      </w:r>
-      <w:proofErr w:type="spellEnd"/>
-      <w:r>
-        <w:rPr>
-          <w:i/>
-          <w:iCs/>
-          <w:color w:val="555555"/>
-          <w:sz w:val="19"/>
-          <w:szCs w:val="19"/>
-        </w:rPr>
-        <w:t xml:space="preserve">, FCM), REST APIs, </w:t>
-      </w:r>
-      <w:proofErr w:type="spellStart"/>
-      <w:r>
-        <w:rPr>
-          <w:i/>
-          <w:iCs/>
-          <w:color w:val="555555"/>
-          <w:sz w:val="19"/>
-          <w:szCs w:val="19"/>
-        </w:rPr>
-        <w:t>WebSockets</w:t>
-      </w:r>
-      <w:proofErr w:type="spellEnd"/>
-      <w:r>
-        <w:rPr>
-          <w:i/>
-          <w:iCs/>
-          <w:color w:val="555555"/>
-          <w:sz w:val="19"/>
-          <w:szCs w:val="19"/>
-        </w:rPr>
-        <w:t>, Bloc/Cubit, Clean Architecture</w:t>
+        <w:t xml:space="preserve">Flutter, Dart, Firebase (Auth, Firestore, FCM), REST APIs, WebSockets, Bloc/Cubit, Clean Architecture</w:t>
       </w:r>
     </w:p>
     <w:p>
@@ -945,21 +769,7 @@
         <w:rPr>
           <w:color w:val="333333"/>
         </w:rPr>
-        <w:t xml:space="preserve">Integrated real-time technical support via a WhatsApp chat integration and a custom in-app live chat built with </w:t>
-      </w:r>
-      <w:proofErr w:type="spellStart"/>
-      <w:r>
-        <w:rPr>
-          <w:color w:val="333333"/>
-        </w:rPr>
-        <w:t>WebSockets</w:t>
-      </w:r>
-      <w:proofErr w:type="spellEnd"/>
-      <w:r>
-        <w:rPr>
-          <w:color w:val="333333"/>
-        </w:rPr>
-        <w:t>.</w:t>
+        <w:t xml:space="preserve">Integrated real-time technical support via a WhatsApp chat integration and a custom in-app live chat built with WebSockets.</w:t>
       </w:r>
     </w:p>
     <w:p>
@@ -1001,29 +811,7 @@
           <w:sz w:val="19"/>
           <w:szCs w:val="19"/>
         </w:rPr>
-        <w:t xml:space="preserve">Flutter, Dart, Firebase (Auth, </w:t>
-      </w:r>
-      <w:proofErr w:type="spellStart"/>
-      <w:r>
-        <w:rPr>
-          <w:i/>
-          <w:iCs/>
-          <w:color w:val="555555"/>
-          <w:sz w:val="19"/>
-          <w:szCs w:val="19"/>
-        </w:rPr>
-        <w:t>Firestore</w:t>
-      </w:r>
-      <w:proofErr w:type="spellEnd"/>
-      <w:r>
-        <w:rPr>
-          <w:i/>
-          <w:iCs/>
-          <w:color w:val="555555"/>
-          <w:sz w:val="19"/>
-          <w:szCs w:val="19"/>
-        </w:rPr>
-        <w:t>, FCM), REST APIs, Bloc/Cubit, MVVM, Clean Architecture</w:t>
+        <w:t xml:space="preserve">Flutter, Dart, Firebase (Auth, Firestore, FCM), REST APIs, Bloc/Cubit, MVVM, Clean Architecture</w:t>
       </w:r>
     </w:p>
     <w:p>
@@ -1093,21 +881,7 @@
         <w:rPr>
           <w:color w:val="333333"/>
         </w:rPr>
-        <w:t xml:space="preserve">Developed a patient management and appointment app for clinics with </w:t>
-      </w:r>
-      <w:proofErr w:type="spellStart"/>
-      <w:r>
-        <w:rPr>
-          <w:color w:val="333333"/>
-        </w:rPr>
-        <w:t>organised</w:t>
-      </w:r>
-      <w:proofErr w:type="spellEnd"/>
-      <w:r>
-        <w:rPr>
-          <w:color w:val="333333"/>
-        </w:rPr>
-        <w:t xml:space="preserve"> scheduling and visit tracking.</w:t>
+        <w:t xml:space="preserve">Developed a patient management and appointment app for clinics with organised scheduling and visit tracking.</w:t>
       </w:r>
     </w:p>
     <w:p>
@@ -1123,21 +897,7 @@
         <w:rPr>
           <w:color w:val="333333"/>
         </w:rPr>
-        <w:t xml:space="preserve">Stored patient basic info, health details, and per-visit doctor notes in Firebase </w:t>
-      </w:r>
-      <w:proofErr w:type="spellStart"/>
-      <w:r>
-        <w:rPr>
-          <w:color w:val="333333"/>
-        </w:rPr>
-        <w:t>Firestore</w:t>
-      </w:r>
-      <w:proofErr w:type="spellEnd"/>
-      <w:r>
-        <w:rPr>
-          <w:color w:val="333333"/>
-        </w:rPr>
-        <w:t>.</w:t>
+        <w:t xml:space="preserve">Stored patient basic info, health details, and per-visit doctor notes in Firebase Firestore.</w:t>
       </w:r>
     </w:p>
     <w:p>
@@ -1330,21 +1090,7 @@
         <w:rPr>
           <w:color w:val="333333"/>
         </w:rPr>
-        <w:t xml:space="preserve">Integrated the </w:t>
-      </w:r>
-      <w:proofErr w:type="spellStart"/>
-      <w:r>
-        <w:rPr>
-          <w:color w:val="333333"/>
-        </w:rPr>
-        <w:t>QCard</w:t>
-      </w:r>
-      <w:proofErr w:type="spellEnd"/>
-      <w:r>
-        <w:rPr>
-          <w:color w:val="333333"/>
-        </w:rPr>
-        <w:t xml:space="preserve"> payment gateway to support in-app payments.</w:t>
+        <w:t xml:space="preserve">Integrated the QCard payment gateway to support in-app payments.</w:t>
       </w:r>
     </w:p>
     <w:p>
@@ -1401,21 +1147,7 @@
         <w:rPr>
           <w:color w:val="333333"/>
         </w:rPr>
-        <w:t xml:space="preserve">Flutter, RESTful APIs, </w:t>
-      </w:r>
-      <w:proofErr w:type="spellStart"/>
-      <w:r>
-        <w:rPr>
-          <w:color w:val="333333"/>
-        </w:rPr>
-        <w:t>WebSockets</w:t>
-      </w:r>
-      <w:proofErr w:type="spellEnd"/>
-      <w:r>
-        <w:rPr>
-          <w:color w:val="333333"/>
-        </w:rPr>
-        <w:t>, Google Maps SDK</w:t>
+        <w:t xml:space="preserve">Flutter, RESTful APIs, WebSockets, Google Maps SDK</w:t>
       </w:r>
     </w:p>
     <w:p>
@@ -1434,21 +1166,7 @@
         <w:rPr>
           <w:color w:val="333333"/>
         </w:rPr>
-        <w:t xml:space="preserve">Firebase (Authentication, </w:t>
-      </w:r>
-      <w:proofErr w:type="spellStart"/>
-      <w:r>
-        <w:rPr>
-          <w:color w:val="333333"/>
-        </w:rPr>
-        <w:t>Firestore</w:t>
-      </w:r>
-      <w:proofErr w:type="spellEnd"/>
-      <w:r>
-        <w:rPr>
-          <w:color w:val="333333"/>
-        </w:rPr>
-        <w:t>, Cloud Messaging)</w:t>
+        <w:t xml:space="preserve">Firebase (Authentication, Firestore, Cloud Messaging)</w:t>
       </w:r>
     </w:p>
     <w:p>
@@ -1486,21 +1204,7 @@
         <w:rPr>
           <w:color w:val="333333"/>
         </w:rPr>
-        <w:t>Clean Architecture, MVVM, Repository Pattern, Dependency Injection (</w:t>
-      </w:r>
-      <w:proofErr w:type="spellStart"/>
-      <w:r>
-        <w:rPr>
-          <w:color w:val="333333"/>
-        </w:rPr>
-        <w:t>GetIt</w:t>
-      </w:r>
-      <w:proofErr w:type="spellEnd"/>
-      <w:r>
-        <w:rPr>
-          <w:color w:val="333333"/>
-        </w:rPr>
-        <w:t>, Injectable)</w:t>
+        <w:t>Clean Architecture, MVVM, Repository Pattern, Dependency Injection (GetIt, Injectable)</w:t>
       </w:r>
     </w:p>
     <w:p>
@@ -1538,21 +1242,7 @@
         <w:rPr>
           <w:color w:val="333333"/>
         </w:rPr>
-        <w:t xml:space="preserve">CI/CD Pipelines, GitHub Actions, Version Automation, Build Configuration (Gradle, </w:t>
-      </w:r>
-      <w:proofErr w:type="spellStart"/>
-      <w:r>
-        <w:rPr>
-          <w:color w:val="333333"/>
-        </w:rPr>
-        <w:t>Info.plist</w:t>
-      </w:r>
-      <w:proofErr w:type="spellEnd"/>
-      <w:r>
-        <w:rPr>
-          <w:color w:val="333333"/>
-        </w:rPr>
-        <w:t>)</w:t>
+        <w:t xml:space="preserve">CI/CD Pipelines, GitHub Actions, Version Automation, Build Configuration (Gradle, Info.plist)</w:t>
       </w:r>
     </w:p>
     <w:p>

</xml_diff>